<commit_message>
Apply consistency review fixes to the drafted documents
- Merchant-application (KYC) data placed outside Customer Data and the DPA;
  DPA Permitted Sensitive Data widened to cover the customer's own TIN
- DPA deletion timeline tied to Organization deletion; backup TBD added
- Terms: "Processor" renamed "Payment Processor"; Payor coverage, fee
  circumvention, account-deletion choices, no-interest statement added
- Privacy Policy and Cookie Notice: Payor data, Brevo marketing-only email
  beacons, Sentry, product description aligned, support@ for account help
- Rebuilt .docx exports

Co-Authored-By: Claude Fable 5.1 <noreply@anthropic.com>
Claude-Session: https://claude.ai/code/session_01QEosvSWHrEk4K1Z5DJ1aNH
</commit_message>
<xml_diff>
--- a/output/docx/cookie-notice.docx
+++ b/output/docx/cookie-notice.docx
@@ -88,7 +88,7 @@
     </w:p>
     <w:p>
       <w:r>
-        <w:t>We use two broad categories of cookies: (1) first party cookies, served directly by us to your computer or mobile device, which we use to recognize your computer or mobile device when it revisits our Sites; and (2) third-party cookies, which are served by service providers or business partners on our Sites, and can be used by these parties to recognize your computer or mobile device when it visits other websites. Third-party cookies can be used for a variety of purposes, including site analytics and sign-in features.</w:t>
+        <w:t>We use two broad categories of cookies: (1) first party cookies, served directly by us to your computer or mobile device, which we use to recognize your computer or mobile device when it revisits our Sites; and (2) third-party cookies, which are served by service providers on our Sites, and can be used by these parties to recognize your computer or mobile device when it visits other websites. Third-party cookies can be used for a variety of purposes, including site analytics and sign-in features.</w:t>
       </w:r>
     </w:p>
     <w:p>
@@ -255,7 +255,7 @@
           <w:p>
             <w:r/>
             <w:r>
-              <w:t>These cookies help us understand how our services are performing and being used. These cookies may work with web beacons included in emails we send to track which emails are opened and which links are clicked by recipients.</w:t>
+              <w:t>These cookies help us understand how our services are performing and being used.</w:t>
             </w:r>
           </w:p>
         </w:tc>
@@ -413,7 +413,7 @@
         <w:t>Web Beacons.</w:t>
       </w:r>
       <w:r>
-        <w:t xml:space="preserve"> We may also use web beacons (which are also known as pixel tags and clear GIFs) on our Sites and in our HTML formatted marketing emails to track the actions of users on our Sites and interactions with our emails. Unlike cookies, which are stored on the hard drive of your computer or mobile device by a website, pixel tags are embedded invisibly on webpages or within HTML formatted emails. Pixel tags are used to demonstrate that a webpage was accessed or that certain content was viewed, typically to measure the success of our marketing campaigns or engagement with our emails and to compile statistics about usage of the Sites, so that we can manage our content more effectively.</w:t>
+        <w:t xml:space="preserve"> Our email delivery provider, Brevo, includes web beacons in our marketing emails to track which emails are opened and which links are clicked by recipients. We may also use web beacons (which are also known as pixel tags and clear GIFs) on our Sites and in our HTML formatted marketing emails to track the actions of users on our Sites and interactions with our emails. Unlike cookies, which are stored on the hard drive of your computer or mobile device by a website, pixel tags are embedded invisibly on webpages or within HTML formatted emails. Pixel tags are used to demonstrate that a webpage was accessed or that certain content was viewed, typically to measure the success of our marketing campaigns or engagement with our emails and to compile statistics about usage of the Sites, so that we can manage our content more effectively.</w:t>
       </w:r>
     </w:p>
     <w:p>

</xml_diff>